<commit_message>
docs: completar indice y ajustar encabezados
</commit_message>
<xml_diff>
--- a/docs/entrega/Despensa-Memoria-Final.docx
+++ b/docs/entrega/Despensa-Memoria-Final.docx
@@ -162,171 +162,786 @@
     </w:p>
     <w:p>
       <w:pPr>
-        <w:pStyle w:val="Normal"/>
-        <w:widowControl/>
-        <w:jc w:val="both"/>
-      </w:pPr>
-      <w:r>
-        <w:rPr>
-          <w:rFonts w:ascii="Garamond" w:hAnsi="Garamond"/>
+        <w:widowControl/>
+        <w:spacing w:after="20" w:line="240" w:lineRule="auto"/>
+        <w:ind w:left="0"/>
+      </w:pPr>
+      <w:r>
+        <w:rPr>
+          <w:rFonts w:ascii="Garamond" w:hAnsi="Garamond"/>
+          <w:b/>
+          <w:color w:val="17365D"/>
+          <w:sz w:val="19"/>
         </w:rPr>
         <w:t>1. Especificación y Análisis del problema</w:t>
       </w:r>
     </w:p>
     <w:p>
       <w:pPr>
-        <w:pStyle w:val="Normal"/>
-        <w:widowControl/>
-        <w:jc w:val="both"/>
-      </w:pPr>
-      <w:r>
-        <w:rPr>
-          <w:rFonts w:ascii="Garamond" w:hAnsi="Garamond"/>
-        </w:rPr>
-        <w:t xml:space="preserve">   1.1. Visión general del proyecto de aplicación móvil</w:t>
-      </w:r>
-    </w:p>
-    <w:p>
-      <w:pPr>
-        <w:pStyle w:val="Normal"/>
-        <w:widowControl/>
-        <w:jc w:val="both"/>
-      </w:pPr>
-      <w:r>
-        <w:rPr>
-          <w:rFonts w:ascii="Garamond" w:hAnsi="Garamond"/>
-        </w:rPr>
-        <w:t xml:space="preserve">   1.2. Descripción gráfica y ergonómica de la aplicación</w:t>
-      </w:r>
-    </w:p>
-    <w:p>
-      <w:pPr>
-        <w:pStyle w:val="Normal"/>
-        <w:widowControl/>
-        <w:jc w:val="both"/>
-      </w:pPr>
-      <w:r>
-        <w:rPr>
-          <w:rFonts w:ascii="Garamond" w:hAnsi="Garamond"/>
-        </w:rPr>
-        <w:t xml:space="preserve">   1.3. Descripción funcional y técnica. Métricas KPI</w:t>
-      </w:r>
-    </w:p>
-    <w:p>
-      <w:pPr>
-        <w:pStyle w:val="Normal"/>
-        <w:widowControl/>
-        <w:jc w:val="both"/>
-      </w:pPr>
-      <w:r>
-        <w:rPr>
-          <w:rFonts w:ascii="Garamond" w:hAnsi="Garamond"/>
-        </w:rPr>
-        <w:t xml:space="preserve">   1.4. Desarrollo backend de aplicaciones móviles</w:t>
-      </w:r>
-    </w:p>
-    <w:p>
-      <w:pPr>
-        <w:pStyle w:val="Normal"/>
-        <w:widowControl/>
-        <w:jc w:val="both"/>
-      </w:pPr>
-      <w:r>
-        <w:rPr>
-          <w:rFonts w:ascii="Garamond" w:hAnsi="Garamond"/>
-        </w:rPr>
-        <w:t xml:space="preserve">   1.5. Descripción de los tipos de pruebas a realizar</w:t>
-      </w:r>
-    </w:p>
-    <w:p>
-      <w:pPr>
-        <w:pStyle w:val="Normal"/>
-        <w:widowControl/>
-        <w:jc w:val="both"/>
-      </w:pPr>
-      <w:r>
-        <w:rPr>
-          <w:rFonts w:ascii="Garamond" w:hAnsi="Garamond"/>
-        </w:rPr>
-        <w:t xml:space="preserve">   1.6. Servicios integrados, proveedores y planificación</w:t>
-      </w:r>
-    </w:p>
-    <w:p>
-      <w:pPr>
-        <w:pStyle w:val="Normal"/>
-        <w:widowControl/>
-        <w:jc w:val="both"/>
-      </w:pPr>
-      <w:r>
-        <w:rPr>
-          <w:rFonts w:ascii="Garamond" w:hAnsi="Garamond"/>
+        <w:widowControl/>
+        <w:spacing w:after="20" w:line="240" w:lineRule="auto"/>
+        <w:ind w:left="317"/>
+      </w:pPr>
+      <w:r>
+        <w:rPr>
+          <w:rFonts w:ascii="Garamond" w:hAnsi="Garamond"/>
+          <w:b w:val="0"/>
+          <w:color w:val="17365D"/>
+          <w:sz w:val="18"/>
+        </w:rPr>
+        <w:t>1.1. Visión general del proyecto de aplicación móvil</w:t>
+      </w:r>
+    </w:p>
+    <w:p>
+      <w:pPr>
+        <w:widowControl/>
+        <w:spacing w:after="20" w:line="240" w:lineRule="auto"/>
+        <w:ind w:left="634"/>
+      </w:pPr>
+      <w:r>
+        <w:rPr>
+          <w:rFonts w:ascii="Garamond" w:hAnsi="Garamond"/>
+          <w:b w:val="0"/>
+          <w:color w:val="17365D"/>
+          <w:sz w:val="18"/>
+        </w:rPr>
+        <w:t>1.1.1. Presentación del proyecto</w:t>
+      </w:r>
+    </w:p>
+    <w:p>
+      <w:pPr>
+        <w:widowControl/>
+        <w:spacing w:after="20" w:line="240" w:lineRule="auto"/>
+        <w:ind w:left="634"/>
+      </w:pPr>
+      <w:r>
+        <w:rPr>
+          <w:rFonts w:ascii="Garamond" w:hAnsi="Garamond"/>
+          <w:b w:val="0"/>
+          <w:color w:val="17365D"/>
+          <w:sz w:val="18"/>
+        </w:rPr>
+        <w:t>1.1.2. Objetivos</w:t>
+      </w:r>
+    </w:p>
+    <w:p>
+      <w:pPr>
+        <w:widowControl/>
+        <w:spacing w:after="20" w:line="240" w:lineRule="auto"/>
+        <w:ind w:left="634"/>
+      </w:pPr>
+      <w:r>
+        <w:rPr>
+          <w:rFonts w:ascii="Garamond" w:hAnsi="Garamond"/>
+          <w:b w:val="0"/>
+          <w:color w:val="17365D"/>
+          <w:sz w:val="18"/>
+        </w:rPr>
+        <w:t>1.1.3. Público objetivo</w:t>
+      </w:r>
+    </w:p>
+    <w:p>
+      <w:pPr>
+        <w:widowControl/>
+        <w:spacing w:after="20" w:line="240" w:lineRule="auto"/>
+        <w:ind w:left="634"/>
+      </w:pPr>
+      <w:r>
+        <w:rPr>
+          <w:rFonts w:ascii="Garamond" w:hAnsi="Garamond"/>
+          <w:b w:val="0"/>
+          <w:color w:val="17365D"/>
+          <w:sz w:val="18"/>
+        </w:rPr>
+        <w:t>1.1.4. Objetivos cuantitativos</w:t>
+      </w:r>
+    </w:p>
+    <w:p>
+      <w:pPr>
+        <w:widowControl/>
+        <w:spacing w:after="20" w:line="240" w:lineRule="auto"/>
+        <w:ind w:left="634"/>
+      </w:pPr>
+      <w:r>
+        <w:rPr>
+          <w:rFonts w:ascii="Garamond" w:hAnsi="Garamond"/>
+          <w:b w:val="0"/>
+          <w:color w:val="17365D"/>
+          <w:sz w:val="18"/>
+        </w:rPr>
+        <w:t>1.1.5. Especificaciones técnicas</w:t>
+      </w:r>
+    </w:p>
+    <w:p>
+      <w:pPr>
+        <w:widowControl/>
+        <w:spacing w:after="20" w:line="240" w:lineRule="auto"/>
+        <w:ind w:left="634"/>
+      </w:pPr>
+      <w:r>
+        <w:rPr>
+          <w:rFonts w:ascii="Garamond" w:hAnsi="Garamond"/>
+          <w:b w:val="0"/>
+          <w:color w:val="17365D"/>
+          <w:sz w:val="18"/>
+        </w:rPr>
+        <w:t>1.1.6. Recursos existentes</w:t>
+      </w:r>
+    </w:p>
+    <w:p>
+      <w:pPr>
+        <w:widowControl/>
+        <w:spacing w:after="20" w:line="240" w:lineRule="auto"/>
+        <w:ind w:left="634"/>
+      </w:pPr>
+      <w:r>
+        <w:rPr>
+          <w:rFonts w:ascii="Garamond" w:hAnsi="Garamond"/>
+          <w:b w:val="0"/>
+          <w:color w:val="17365D"/>
+          <w:sz w:val="18"/>
+        </w:rPr>
+        <w:t>1.1.7. Aplicaciones similares</w:t>
+      </w:r>
+    </w:p>
+    <w:p>
+      <w:pPr>
+        <w:widowControl/>
+        <w:spacing w:after="20" w:line="240" w:lineRule="auto"/>
+        <w:ind w:left="317"/>
+      </w:pPr>
+      <w:r>
+        <w:rPr>
+          <w:rFonts w:ascii="Garamond" w:hAnsi="Garamond"/>
+          <w:b w:val="0"/>
+          <w:color w:val="17365D"/>
+          <w:sz w:val="18"/>
+        </w:rPr>
+        <w:t>1.2. Descripción gráfica y ergonómica de la aplicación</w:t>
+      </w:r>
+    </w:p>
+    <w:p>
+      <w:pPr>
+        <w:widowControl/>
+        <w:spacing w:after="20" w:line="240" w:lineRule="auto"/>
+        <w:ind w:left="634"/>
+      </w:pPr>
+      <w:r>
+        <w:rPr>
+          <w:rFonts w:ascii="Garamond" w:hAnsi="Garamond"/>
+          <w:b w:val="0"/>
+          <w:color w:val="17365D"/>
+          <w:sz w:val="18"/>
+        </w:rPr>
+        <w:t>1.2.1. Identidad gráfica</w:t>
+      </w:r>
+    </w:p>
+    <w:p>
+      <w:pPr>
+        <w:widowControl/>
+        <w:spacing w:after="20" w:line="240" w:lineRule="auto"/>
+        <w:ind w:left="634"/>
+      </w:pPr>
+      <w:r>
+        <w:rPr>
+          <w:rFonts w:ascii="Garamond" w:hAnsi="Garamond"/>
+          <w:b w:val="0"/>
+          <w:color w:val="17365D"/>
+          <w:sz w:val="18"/>
+        </w:rPr>
+        <w:t>1.2.2. Diseño de interfaz y navegación</w:t>
+      </w:r>
+    </w:p>
+    <w:p>
+      <w:pPr>
+        <w:widowControl/>
+        <w:spacing w:after="20" w:line="240" w:lineRule="auto"/>
+        <w:ind w:left="317"/>
+      </w:pPr>
+      <w:r>
+        <w:rPr>
+          <w:rFonts w:ascii="Garamond" w:hAnsi="Garamond"/>
+          <w:b w:val="0"/>
+          <w:color w:val="17365D"/>
+          <w:sz w:val="18"/>
+        </w:rPr>
+        <w:t>1.3. Descripción funcional y técnica. Métricas de rendimiento (KPI)</w:t>
+      </w:r>
+    </w:p>
+    <w:p>
+      <w:pPr>
+        <w:widowControl/>
+        <w:spacing w:after="20" w:line="240" w:lineRule="auto"/>
+        <w:ind w:left="634"/>
+      </w:pPr>
+      <w:r>
+        <w:rPr>
+          <w:rFonts w:ascii="Garamond" w:hAnsi="Garamond"/>
+          <w:b w:val="0"/>
+          <w:color w:val="17365D"/>
+          <w:sz w:val="18"/>
+        </w:rPr>
+        <w:t>1.3.1. Requisitos funcionales</w:t>
+      </w:r>
+    </w:p>
+    <w:p>
+      <w:pPr>
+        <w:widowControl/>
+        <w:spacing w:after="20" w:line="240" w:lineRule="auto"/>
+        <w:ind w:left="634"/>
+      </w:pPr>
+      <w:r>
+        <w:rPr>
+          <w:rFonts w:ascii="Garamond" w:hAnsi="Garamond"/>
+          <w:b w:val="0"/>
+          <w:color w:val="17365D"/>
+          <w:sz w:val="18"/>
+        </w:rPr>
+        <w:t>1.3.2. Requisitos no funcionales</w:t>
+      </w:r>
+    </w:p>
+    <w:p>
+      <w:pPr>
+        <w:widowControl/>
+        <w:spacing w:after="20" w:line="240" w:lineRule="auto"/>
+        <w:ind w:left="634"/>
+      </w:pPr>
+      <w:r>
+        <w:rPr>
+          <w:rFonts w:ascii="Garamond" w:hAnsi="Garamond"/>
+          <w:b w:val="0"/>
+          <w:color w:val="17365D"/>
+          <w:sz w:val="18"/>
+        </w:rPr>
+        <w:t>1.3.3. Modelo de casos de uso</w:t>
+      </w:r>
+    </w:p>
+    <w:p>
+      <w:pPr>
+        <w:widowControl/>
+        <w:spacing w:after="20" w:line="240" w:lineRule="auto"/>
+        <w:ind w:left="634"/>
+      </w:pPr>
+      <w:r>
+        <w:rPr>
+          <w:rFonts w:ascii="Garamond" w:hAnsi="Garamond"/>
+          <w:b w:val="0"/>
+          <w:color w:val="17365D"/>
+          <w:sz w:val="18"/>
+        </w:rPr>
+        <w:t>1.3.4. KPI</w:t>
+      </w:r>
+    </w:p>
+    <w:p>
+      <w:pPr>
+        <w:widowControl/>
+        <w:spacing w:after="20" w:line="240" w:lineRule="auto"/>
+        <w:ind w:left="317"/>
+      </w:pPr>
+      <w:r>
+        <w:rPr>
+          <w:rFonts w:ascii="Garamond" w:hAnsi="Garamond"/>
+          <w:b w:val="0"/>
+          <w:color w:val="17365D"/>
+          <w:sz w:val="18"/>
+        </w:rPr>
+        <w:t>1.4. Desarrollo backend de aplicaciones móviles</w:t>
+      </w:r>
+    </w:p>
+    <w:p>
+      <w:pPr>
+        <w:widowControl/>
+        <w:spacing w:after="20" w:line="240" w:lineRule="auto"/>
+        <w:ind w:left="634"/>
+      </w:pPr>
+      <w:r>
+        <w:rPr>
+          <w:rFonts w:ascii="Garamond" w:hAnsi="Garamond"/>
+          <w:b w:val="0"/>
+          <w:color w:val="17365D"/>
+          <w:sz w:val="18"/>
+        </w:rPr>
+        <w:t>1.4.1. Arquitectura</w:t>
+      </w:r>
+    </w:p>
+    <w:p>
+      <w:pPr>
+        <w:widowControl/>
+        <w:spacing w:after="20" w:line="240" w:lineRule="auto"/>
+        <w:ind w:left="634"/>
+      </w:pPr>
+      <w:r>
+        <w:rPr>
+          <w:rFonts w:ascii="Garamond" w:hAnsi="Garamond"/>
+          <w:b w:val="0"/>
+          <w:color w:val="17365D"/>
+          <w:sz w:val="18"/>
+        </w:rPr>
+        <w:t>1.4.2. Modelo de datos</w:t>
+      </w:r>
+    </w:p>
+    <w:p>
+      <w:pPr>
+        <w:widowControl/>
+        <w:spacing w:after="20" w:line="240" w:lineRule="auto"/>
+        <w:ind w:left="634"/>
+      </w:pPr>
+      <w:r>
+        <w:rPr>
+          <w:rFonts w:ascii="Garamond" w:hAnsi="Garamond"/>
+          <w:b w:val="0"/>
+          <w:color w:val="17365D"/>
+          <w:sz w:val="18"/>
+        </w:rPr>
+        <w:t>1.4.3. Seguridad y tiempo real</w:t>
+      </w:r>
+    </w:p>
+    <w:p>
+      <w:pPr>
+        <w:widowControl/>
+        <w:spacing w:after="20" w:line="240" w:lineRule="auto"/>
+        <w:ind w:left="317"/>
+      </w:pPr>
+      <w:r>
+        <w:rPr>
+          <w:rFonts w:ascii="Garamond" w:hAnsi="Garamond"/>
+          <w:b w:val="0"/>
+          <w:color w:val="17365D"/>
+          <w:sz w:val="18"/>
+        </w:rPr>
+        <w:t>1.5. Descripción de los tipos de pruebas a realizar</w:t>
+      </w:r>
+    </w:p>
+    <w:p>
+      <w:pPr>
+        <w:widowControl/>
+        <w:spacing w:after="20" w:line="240" w:lineRule="auto"/>
+        <w:ind w:left="634"/>
+      </w:pPr>
+      <w:r>
+        <w:rPr>
+          <w:rFonts w:ascii="Garamond" w:hAnsi="Garamond"/>
+          <w:b w:val="0"/>
+          <w:color w:val="17365D"/>
+          <w:sz w:val="18"/>
+        </w:rPr>
+        <w:t>1.5.1. Herramientas</w:t>
+      </w:r>
+    </w:p>
+    <w:p>
+      <w:pPr>
+        <w:widowControl/>
+        <w:spacing w:after="20" w:line="240" w:lineRule="auto"/>
+        <w:ind w:left="634"/>
+      </w:pPr>
+      <w:r>
+        <w:rPr>
+          <w:rFonts w:ascii="Garamond" w:hAnsi="Garamond"/>
+          <w:b w:val="0"/>
+          <w:color w:val="17365D"/>
+          <w:sz w:val="18"/>
+        </w:rPr>
+        <w:t>1.5.2. Alcance y metodología</w:t>
+      </w:r>
+    </w:p>
+    <w:p>
+      <w:pPr>
+        <w:widowControl/>
+        <w:spacing w:after="20" w:line="240" w:lineRule="auto"/>
+        <w:ind w:left="634"/>
+      </w:pPr>
+      <w:r>
+        <w:rPr>
+          <w:rFonts w:ascii="Garamond" w:hAnsi="Garamond"/>
+          <w:b w:val="0"/>
+          <w:color w:val="17365D"/>
+          <w:sz w:val="18"/>
+        </w:rPr>
+        <w:t>1.5.3. Resultado</w:t>
+      </w:r>
+    </w:p>
+    <w:p>
+      <w:pPr>
+        <w:widowControl/>
+        <w:spacing w:after="20" w:line="240" w:lineRule="auto"/>
+        <w:ind w:left="317"/>
+      </w:pPr>
+      <w:r>
+        <w:rPr>
+          <w:rFonts w:ascii="Garamond" w:hAnsi="Garamond"/>
+          <w:b w:val="0"/>
+          <w:color w:val="17365D"/>
+          <w:sz w:val="18"/>
+        </w:rPr>
+        <w:t>1.6. Servicios integrados, proveedores y planificación</w:t>
+      </w:r>
+    </w:p>
+    <w:p>
+      <w:pPr>
+        <w:widowControl/>
+        <w:spacing w:after="20" w:line="240" w:lineRule="auto"/>
+        <w:ind w:left="0"/>
+      </w:pPr>
+      <w:r>
+        <w:rPr>
+          <w:rFonts w:ascii="Garamond" w:hAnsi="Garamond"/>
+          <w:b/>
+          <w:color w:val="17365D"/>
+          <w:sz w:val="19"/>
         </w:rPr>
         <w:t>2. Desarrollo del proyecto acorde a SCRUM</w:t>
       </w:r>
     </w:p>
     <w:p>
       <w:pPr>
-        <w:pStyle w:val="Normal"/>
-        <w:widowControl/>
-        <w:jc w:val="both"/>
-      </w:pPr>
-      <w:r>
-        <w:rPr>
-          <w:rFonts w:ascii="Garamond" w:hAnsi="Garamond"/>
+        <w:widowControl/>
+        <w:spacing w:after="20" w:line="240" w:lineRule="auto"/>
+        <w:ind w:left="317"/>
+      </w:pPr>
+      <w:r>
+        <w:rPr>
+          <w:rFonts w:ascii="Garamond" w:hAnsi="Garamond"/>
+          <w:b w:val="0"/>
+          <w:color w:val="17365D"/>
+          <w:sz w:val="18"/>
+        </w:rPr>
+        <w:t>2.1. Herramientas para la gestión</w:t>
+      </w:r>
+    </w:p>
+    <w:p>
+      <w:pPr>
+        <w:widowControl/>
+        <w:spacing w:after="20" w:line="240" w:lineRule="auto"/>
+        <w:ind w:left="317"/>
+      </w:pPr>
+      <w:r>
+        <w:rPr>
+          <w:rFonts w:ascii="Garamond" w:hAnsi="Garamond"/>
+          <w:b w:val="0"/>
+          <w:color w:val="17365D"/>
+          <w:sz w:val="18"/>
+        </w:rPr>
+        <w:t>2.2. Roles</w:t>
+      </w:r>
+    </w:p>
+    <w:p>
+      <w:pPr>
+        <w:widowControl/>
+        <w:spacing w:after="20" w:line="240" w:lineRule="auto"/>
+        <w:ind w:left="317"/>
+      </w:pPr>
+      <w:r>
+        <w:rPr>
+          <w:rFonts w:ascii="Garamond" w:hAnsi="Garamond"/>
+          <w:b w:val="0"/>
+          <w:color w:val="17365D"/>
+          <w:sz w:val="18"/>
+        </w:rPr>
+        <w:t>2.3. Componentes y reuniones</w:t>
+      </w:r>
+    </w:p>
+    <w:p>
+      <w:pPr>
+        <w:widowControl/>
+        <w:spacing w:after="20" w:line="240" w:lineRule="auto"/>
+        <w:ind w:left="317"/>
+      </w:pPr>
+      <w:r>
+        <w:rPr>
+          <w:rFonts w:ascii="Garamond" w:hAnsi="Garamond"/>
+          <w:b w:val="0"/>
+          <w:color w:val="17365D"/>
+          <w:sz w:val="18"/>
+        </w:rPr>
+        <w:t>2.4. Sprints</w:t>
+      </w:r>
+    </w:p>
+    <w:p>
+      <w:pPr>
+        <w:widowControl/>
+        <w:spacing w:after="20" w:line="240" w:lineRule="auto"/>
+        <w:ind w:left="634"/>
+      </w:pPr>
+      <w:r>
+        <w:rPr>
+          <w:rFonts w:ascii="Garamond" w:hAnsi="Garamond"/>
+          <w:b w:val="0"/>
+          <w:color w:val="17365D"/>
+          <w:sz w:val="18"/>
+        </w:rPr>
+        <w:t>2.4.1. Sprint 1 — Análisis y Diseño</w:t>
+      </w:r>
+    </w:p>
+    <w:p>
+      <w:pPr>
+        <w:widowControl/>
+        <w:spacing w:after="20" w:line="240" w:lineRule="auto"/>
+        <w:ind w:left="634"/>
+      </w:pPr>
+      <w:r>
+        <w:rPr>
+          <w:rFonts w:ascii="Garamond" w:hAnsi="Garamond"/>
+          <w:b w:val="0"/>
+          <w:color w:val="17365D"/>
+          <w:sz w:val="18"/>
+        </w:rPr>
+        <w:t>2.4.2. Sprint 2 — Base técnica e inventario</w:t>
+      </w:r>
+    </w:p>
+    <w:p>
+      <w:pPr>
+        <w:widowControl/>
+        <w:spacing w:after="20" w:line="240" w:lineRule="auto"/>
+        <w:ind w:left="634"/>
+      </w:pPr>
+      <w:r>
+        <w:rPr>
+          <w:rFonts w:ascii="Garamond" w:hAnsi="Garamond"/>
+          <w:b w:val="0"/>
+          <w:color w:val="17365D"/>
+          <w:sz w:val="18"/>
+        </w:rPr>
+        <w:t>2.4.3. Sprint 3 — Cesta, caducidad y colaboración</w:t>
+      </w:r>
+    </w:p>
+    <w:p>
+      <w:pPr>
+        <w:widowControl/>
+        <w:spacing w:after="20" w:line="240" w:lineRule="auto"/>
+        <w:ind w:left="634"/>
+      </w:pPr>
+      <w:r>
+        <w:rPr>
+          <w:rFonts w:ascii="Garamond" w:hAnsi="Garamond"/>
+          <w:b w:val="0"/>
+          <w:color w:val="17365D"/>
+          <w:sz w:val="18"/>
+        </w:rPr>
+        <w:t>2.4.4. Sprint 4 — Calidad y cierre</w:t>
+      </w:r>
+    </w:p>
+    <w:p>
+      <w:pPr>
+        <w:widowControl/>
+        <w:spacing w:after="20" w:line="240" w:lineRule="auto"/>
+        <w:ind w:left="317"/>
+      </w:pPr>
+      <w:r>
+        <w:rPr>
+          <w:rFonts w:ascii="Garamond" w:hAnsi="Garamond"/>
+          <w:b w:val="0"/>
+          <w:color w:val="17365D"/>
+          <w:sz w:val="18"/>
+        </w:rPr>
+        <w:t>2.5. Seguimiento final de issues</w:t>
+      </w:r>
+    </w:p>
+    <w:p>
+      <w:pPr>
+        <w:widowControl/>
+        <w:spacing w:after="20" w:line="240" w:lineRule="auto"/>
+        <w:ind w:left="0"/>
+      </w:pPr>
+      <w:r>
+        <w:rPr>
+          <w:rFonts w:ascii="Garamond" w:hAnsi="Garamond"/>
+          <w:b/>
+          <w:color w:val="17365D"/>
+          <w:sz w:val="19"/>
         </w:rPr>
         <w:t>3. Casos de Prueba</w:t>
       </w:r>
     </w:p>
     <w:p>
       <w:pPr>
-        <w:pStyle w:val="Normal"/>
-        <w:widowControl/>
-        <w:jc w:val="both"/>
-      </w:pPr>
-      <w:r>
-        <w:rPr>
-          <w:rFonts w:ascii="Garamond" w:hAnsi="Garamond"/>
+        <w:widowControl/>
+        <w:spacing w:after="20" w:line="240" w:lineRule="auto"/>
+        <w:ind w:left="317"/>
+      </w:pPr>
+      <w:r>
+        <w:rPr>
+          <w:rFonts w:ascii="Garamond" w:hAnsi="Garamond"/>
+          <w:b w:val="0"/>
+          <w:color w:val="17365D"/>
+          <w:sz w:val="18"/>
+        </w:rPr>
+        <w:t>3.1. Especificación</w:t>
+      </w:r>
+    </w:p>
+    <w:p>
+      <w:pPr>
+        <w:widowControl/>
+        <w:spacing w:after="20" w:line="240" w:lineRule="auto"/>
+        <w:ind w:left="0"/>
+      </w:pPr>
+      <w:r>
+        <w:rPr>
+          <w:rFonts w:ascii="Garamond" w:hAnsi="Garamond"/>
+          <w:b/>
+          <w:color w:val="17365D"/>
+          <w:sz w:val="19"/>
         </w:rPr>
         <w:t>4. Conclusiones</w:t>
       </w:r>
     </w:p>
     <w:p>
       <w:pPr>
-        <w:pStyle w:val="Normal"/>
-        <w:widowControl/>
-        <w:jc w:val="both"/>
-      </w:pPr>
-      <w:r>
-        <w:rPr>
-          <w:rFonts w:ascii="Garamond" w:hAnsi="Garamond"/>
+        <w:widowControl/>
+        <w:spacing w:after="20" w:line="240" w:lineRule="auto"/>
+        <w:ind w:left="317"/>
+      </w:pPr>
+      <w:r>
+        <w:rPr>
+          <w:rFonts w:ascii="Garamond" w:hAnsi="Garamond"/>
+          <w:b w:val="0"/>
+          <w:color w:val="17365D"/>
+          <w:sz w:val="18"/>
+        </w:rPr>
+        <w:t>4.1. Puntos fuertes</w:t>
+      </w:r>
+    </w:p>
+    <w:p>
+      <w:pPr>
+        <w:widowControl/>
+        <w:spacing w:after="20" w:line="240" w:lineRule="auto"/>
+        <w:ind w:left="317"/>
+      </w:pPr>
+      <w:r>
+        <w:rPr>
+          <w:rFonts w:ascii="Garamond" w:hAnsi="Garamond"/>
+          <w:b w:val="0"/>
+          <w:color w:val="17365D"/>
+          <w:sz w:val="18"/>
+        </w:rPr>
+        <w:t>4.2. Puntos débiles</w:t>
+      </w:r>
+    </w:p>
+    <w:p>
+      <w:pPr>
+        <w:widowControl/>
+        <w:spacing w:after="20" w:line="240" w:lineRule="auto"/>
+        <w:ind w:left="317"/>
+      </w:pPr>
+      <w:r>
+        <w:rPr>
+          <w:rFonts w:ascii="Garamond" w:hAnsi="Garamond"/>
+          <w:b w:val="0"/>
+          <w:color w:val="17365D"/>
+          <w:sz w:val="18"/>
+        </w:rPr>
+        <w:t>4.3. Mejoras futuras</w:t>
+      </w:r>
+    </w:p>
+    <w:p>
+      <w:pPr>
+        <w:widowControl/>
+        <w:spacing w:after="20" w:line="240" w:lineRule="auto"/>
+        <w:ind w:left="0"/>
+      </w:pPr>
+      <w:r>
+        <w:rPr>
+          <w:rFonts w:ascii="Garamond" w:hAnsi="Garamond"/>
+          <w:b/>
+          <w:color w:val="17365D"/>
+          <w:sz w:val="19"/>
         </w:rPr>
         <w:t>Referencias bibliográficas</w:t>
       </w:r>
     </w:p>
     <w:p>
       <w:pPr>
-        <w:pStyle w:val="Normal"/>
-        <w:widowControl/>
-        <w:jc w:val="both"/>
-      </w:pPr>
-      <w:r>
-        <w:rPr>
-          <w:rFonts w:ascii="Garamond" w:hAnsi="Garamond"/>
+        <w:widowControl/>
+        <w:spacing w:after="20" w:line="240" w:lineRule="auto"/>
+        <w:ind w:left="0"/>
+      </w:pPr>
+      <w:r>
+        <w:rPr>
+          <w:rFonts w:ascii="Garamond" w:hAnsi="Garamond"/>
+          <w:b/>
+          <w:color w:val="17365D"/>
+          <w:sz w:val="19"/>
+        </w:rPr>
+        <w:t>ANEXOS</w:t>
+      </w:r>
+    </w:p>
+    <w:p>
+      <w:pPr>
+        <w:widowControl/>
+        <w:spacing w:after="20" w:line="240" w:lineRule="auto"/>
+        <w:ind w:left="317"/>
+      </w:pPr>
+      <w:r>
+        <w:rPr>
+          <w:rFonts w:ascii="Garamond" w:hAnsi="Garamond"/>
+          <w:b w:val="0"/>
+          <w:color w:val="17365D"/>
+          <w:sz w:val="18"/>
         </w:rPr>
         <w:t>ANEXO I. Especificaciones funcionales</w:t>
       </w:r>
     </w:p>
     <w:p>
       <w:pPr>
-        <w:pStyle w:val="Normal"/>
-        <w:widowControl/>
-        <w:jc w:val="both"/>
-      </w:pPr>
-      <w:r>
-        <w:rPr>
-          <w:rFonts w:ascii="Garamond" w:hAnsi="Garamond"/>
+        <w:widowControl/>
+        <w:spacing w:after="20" w:line="240" w:lineRule="auto"/>
+        <w:ind w:left="317"/>
+      </w:pPr>
+      <w:r>
+        <w:rPr>
+          <w:rFonts w:ascii="Garamond" w:hAnsi="Garamond"/>
+          <w:b w:val="0"/>
+          <w:color w:val="17365D"/>
+          <w:sz w:val="18"/>
         </w:rPr>
         <w:t>ANEXO II. Especificaciones formales del sistema</w:t>
+      </w:r>
+    </w:p>
+    <w:p>
+      <w:pPr>
+        <w:widowControl/>
+        <w:spacing w:after="20" w:line="240" w:lineRule="auto"/>
+        <w:ind w:left="634"/>
+      </w:pPr>
+      <w:r>
+        <w:rPr>
+          <w:rFonts w:ascii="Garamond" w:hAnsi="Garamond"/>
+          <w:b w:val="0"/>
+          <w:color w:val="17365D"/>
+          <w:sz w:val="18"/>
+        </w:rPr>
+        <w:t>1. Diseño arquitectónico</w:t>
+      </w:r>
+    </w:p>
+    <w:p>
+      <w:pPr>
+        <w:widowControl/>
+        <w:spacing w:after="20" w:line="240" w:lineRule="auto"/>
+        <w:ind w:left="634"/>
+      </w:pPr>
+      <w:r>
+        <w:rPr>
+          <w:rFonts w:ascii="Garamond" w:hAnsi="Garamond"/>
+          <w:b w:val="0"/>
+          <w:color w:val="17365D"/>
+          <w:sz w:val="18"/>
+        </w:rPr>
+        <w:t>2. Diseño de la base de datos</w:t>
+      </w:r>
+    </w:p>
+    <w:p>
+      <w:pPr>
+        <w:widowControl/>
+        <w:spacing w:after="20" w:line="240" w:lineRule="auto"/>
+        <w:ind w:left="634"/>
+      </w:pPr>
+      <w:r>
+        <w:rPr>
+          <w:rFonts w:ascii="Garamond" w:hAnsi="Garamond"/>
+          <w:b w:val="0"/>
+          <w:color w:val="17365D"/>
+          <w:sz w:val="18"/>
+        </w:rPr>
+        <w:t>3. Evidencias de interfaz y proceso</w:t>
       </w:r>
     </w:p>
     <w:p>
@@ -12088,8 +12703,8 @@
       <w:autoSpaceDE w:val="true"/>
       <w:bidi w:val="0"/>
       <w:snapToGrid w:val="true"/>
-      <w:spacing w:before="200" w:after="100" w:lineRule="auto" w:line="257"/>
-      <w:ind w:start="1231"/>
+      <w:spacing w:before="0" w:after="60" w:lineRule="auto" w:line="257"/>
+      <w:ind w:start="1231" w:left="0" w:firstLine="0"/>
       <w:jc w:val="start"/>
       <w:outlineLvl w:val="0"/>
     </w:pPr>
@@ -12111,7 +12726,7 @@
       <w:w w:val="100"/>
       <w:kern w:val="0"/>
       <w:position w:val="0"/>
-      <w:sz w:val="30"/>
+      <w:sz w:val="24"/>
       <w:sz w:val="36"/>
       <w:szCs w:val="22"/>
       <w:u w:val="none"/>
@@ -12145,8 +12760,8 @@
       <w:autoSpaceDE w:val="true"/>
       <w:bidi w:val="0"/>
       <w:snapToGrid w:val="true"/>
-      <w:spacing w:lineRule="auto" w:line="264" w:before="200" w:after="100"/>
-      <w:ind w:hanging="10" w:start="293"/>
+      <w:spacing w:lineRule="auto" w:line="264" w:before="60" w:after="40"/>
+      <w:ind w:start="293" w:left="0" w:firstLine="0"/>
       <w:jc w:val="start"/>
       <w:outlineLvl w:val="1"/>
     </w:pPr>
@@ -12168,7 +12783,7 @@
       <w:w w:val="100"/>
       <w:kern w:val="0"/>
       <w:position w:val="0"/>
-      <w:sz w:val="25"/>
+      <w:sz w:val="23"/>
       <w:sz w:val="28"/>
       <w:szCs w:val="22"/>
       <w:u w:val="none"/>
@@ -12202,8 +12817,8 @@
       <w:autoSpaceDE w:val="true"/>
       <w:bidi w:val="0"/>
       <w:snapToGrid w:val="true"/>
-      <w:spacing w:lineRule="auto" w:line="266" w:before="200" w:after="100"/>
-      <w:ind w:hanging="10" w:start="293"/>
+      <w:spacing w:lineRule="auto" w:line="266" w:before="40" w:after="20"/>
+      <w:ind w:start="293" w:left="0" w:firstLine="0"/>
       <w:jc w:val="start"/>
       <w:outlineLvl w:val="2"/>
     </w:pPr>
@@ -12225,7 +12840,7 @@
       <w:w w:val="100"/>
       <w:kern w:val="0"/>
       <w:position w:val="0"/>
-      <w:sz w:val="23"/>
+      <w:sz w:val="22"/>
       <w:sz w:val="24"/>
       <w:szCs w:val="22"/>
       <w:u w:val="none"/>

</xml_diff>